<commit_message>
fixed chapters numbering rebuilt docx exports
</commit_message>
<xml_diff>
--- a/chapters/exports/10-grantmgmt.docx
+++ b/chapters/exports/10-grantmgmt.docx
@@ -681,7 +681,7 @@
       </w:r>
     </w:p>
     <w:p>
-      <w:hyperlink w:history="1" r:id="rIdfyuchvomtorupvrjgk2_t">
+      <w:hyperlink w:history="1" r:id="rIdhx_urdjna-dgkz9mn2t9s">
         <w:r>
           <w:rPr>
             <w:rStyle w:val="Hyperlink"/>
@@ -692,7 +692,7 @@
       <w:r>
         <w:t xml:space="preserve"> is an exception to the general financial accounting software. It is available online or as a desktop version and nicely integrates projects from situation assessment, theory of change, results chains, progress tracking, to reporting. It does have a subscription plan of $350/year (2025), more if you want to customize report templates. Still, the community, connection to many foundations and nonprofits that adopted the </w:t>
       </w:r>
-      <w:hyperlink w:history="1" r:id="rIdgygsvk8wgeuvtniwthnby">
+      <w:hyperlink w:history="1" r:id="rId2w04vrjz3jxvxoegwa0p6">
         <w:r>
           <w:rPr>
             <w:rStyle w:val="Hyperlink"/>
@@ -772,7 +772,7 @@
       <w:r>
         <w:t xml:space="preserve">Install </w:t>
       </w:r>
-      <w:hyperlink w:history="1" r:id="rIdzasnzh54kskupwpmi3c16">
+      <w:hyperlink w:history="1" r:id="rIdngths6zv0qdujzgdbi8t5">
         <w:r>
           <w:rPr>
             <w:rStyle w:val="Hyperlink"/>
@@ -1025,7 +1025,7 @@
       <w:r>
         <w:t xml:space="preserve">Download the budget.xlsx and content.md files from </w:t>
       </w:r>
-      <w:hyperlink w:history="1" r:id="rIdjqk_q6xf1cfeyqeczwnna">
+      <w:hyperlink w:history="1" r:id="rIdlcoveebhnm8132vq021qw">
         <w:r>
           <w:rPr>
             <w:rStyle w:val="Hyperlink"/>
@@ -1192,7 +1192,7 @@
       <w:r>
         <w:t xml:space="preserve">). Download </w:t>
       </w:r>
-      <w:hyperlink w:history="1" r:id="rIdhd4lomq3vdrgjl6sxoro5">
+      <w:hyperlink w:history="1" r:id="rIddmwtminec0hk4u1pmsext">
         <w:r>
           <w:rPr>
             <w:rStyle w:val="Hyperlink"/>
@@ -1306,7 +1306,7 @@
       <w:r>
         <w:t xml:space="preserve">Select the report you want to create with content.md and budget.xlsx downloaded from the same </w:t>
       </w:r>
-      <w:hyperlink w:history="1" r:id="rIdgjuqqh7xscfe_40hmuri-">
+      <w:hyperlink w:history="1" r:id="rIdzt7d5imrjbxqfjxkmhf1o">
         <w:r>
           <w:rPr>
             <w:rStyle w:val="Hyperlink"/>
@@ -1480,7 +1480,7 @@
       <w:r>
         <w:t xml:space="preserve">Detailed steps for virtual environment and Visual Studio Code setup can be found in the 1st two appendices of </w:t>
       </w:r>
-      <w:hyperlink w:history="1" r:id="rId8bsmx2gzu1_3neldnvjaw">
+      <w:hyperlink w:history="1" r:id="rId_ok9ct-u0pbofsu3royz4">
         <w:r>
           <w:rPr>
             <w:rStyle w:val="Hyperlink"/>

</xml_diff>